<commit_message>
career: align live release contracts
</commit_message>
<xml_diff>
--- a/career/Zain-Dana-Harper-CV.docx
+++ b/career/Zain-Dana-Harper-CV.docx
@@ -158,12 +158,37 @@
     </w:p>
     <w:p>
       <w:r>
-        <w:t>Research pages are public working records unless a page states otherwise. Research-status</w:t>
+        <w:t>Eight public research records are indexed on</w:t>
       </w:r>
     </w:p>
     <w:p>
       <w:r>
-        <w:t>caveats are preserved; peer review is not implied.</w:t>
+        <w:t>Publications</w:t>
+      </w:r>
+    </w:p>
+    <w:p>
+      <w:r>
+        <w:t>, including DOI records such as</w:t>
+      </w:r>
+    </w:p>
+    <w:p>
+      <w:r>
+        <w:t>doi.org/10.5281/zenodo.21230267</w:t>
+      </w:r>
+    </w:p>
+    <w:p>
+      <w:r>
+        <w:t>. They are not peer reviewed unless a page later records an explicit peer-review status.</w:t>
+      </w:r>
+    </w:p>
+    <w:p>
+      <w:r>
+        <w:t>Accepted external work is separated from open work, closed without merge work, and owned project</w:t>
+      </w:r>
+    </w:p>
+    <w:p>
+      <w:r>
+        <w:t>evidence. Open is not accepted, and this CV does not upgrade either status.</w:t>
       </w:r>
     </w:p>
     <w:p>

</xml_diff>

<commit_message>
site: publish one-definition product release
</commit_message>
<xml_diff>
--- a/career/Zain-Dana-Harper-CV.docx
+++ b/career/Zain-Dana-Harper-CV.docx
@@ -143,17 +143,17 @@
     </w:p>
     <w:p>
       <w:r>
-        <w:t>Flywheel is the primary public system. Related public work includes Terminal State Fixtures,</w:t>
+        <w:t>Flywheel is a shipped agent-workflow platform. Separate public work includes Terminal State</w:t>
       </w:r>
     </w:p>
     <w:p>
       <w:r>
-        <w:t>BuildLang, Gather, Index, Crucible, Brender Archival, Engine Revival, retro-system pages, and</w:t>
+        <w:t>Fixtures, BuildLang, Gather, Index, Crucible, BRender Archival, Engine Revival, retro-system</w:t>
       </w:r>
     </w:p>
     <w:p>
       <w:r>
-        <w:t>public-safe security/evaluation documentation.</w:t>
+        <w:t>pages, and public-safe security and evaluation documentation.</w:t>
       </w:r>
     </w:p>
     <w:p>

</xml_diff>

<commit_message>
feat: make career artifacts deterministic and truth-bounded
</commit_message>
<xml_diff>
--- a/career/Zain-Dana-Harper-CV.docx
+++ b/career/Zain-Dana-Harper-CV.docx
@@ -5,90 +5,104 @@
     <w:p>
       <w:pPr>
         <w:pStyle w:val="Title"/>
+        <w:spacing w:before="0" w:after="30" w:line="240" w:lineRule="auto"/>
       </w:pPr>
       <w:r>
         <w:t>Zain Dana Harper</w:t>
       </w:r>
     </w:p>
     <w:p>
+      <w:pPr>
+        <w:spacing w:before="0" w:after="30" w:line="240" w:lineRule="auto"/>
+      </w:pPr>
       <w:r>
         <w:t>Public-safe CV.</w:t>
       </w:r>
     </w:p>
     <w:p>
+      <w:pPr>
+        <w:spacing w:before="0" w:after="30" w:line="240" w:lineRule="auto"/>
+      </w:pPr>
       <w:r>
-        <w:t>Seattle, Washington</w:t>
+        <w:t>Seattle, Washington | zaindharper@gmail.com | LinkedIn | GitHub</w:t>
       </w:r>
     </w:p>
     <w:p>
-      <w:r>
-        <w:t>zaindharper@gmail.com</w:t>
-      </w:r>
-    </w:p>
-    <w:p>
-      <w:r>
-        <w:t>LinkedIn</w:t>
-      </w:r>
-    </w:p>
-    <w:p>
-      <w:r>
-        <w:t>GitHub</w:t>
-      </w:r>
-    </w:p>
-    <w:p>
+      <w:pPr>
+        <w:pStyle w:val="Heading2"/>
+        <w:spacing w:before="0" w:after="30" w:line="240" w:lineRule="auto"/>
+      </w:pPr>
       <w:r>
         <w:t>Current employment targets</w:t>
       </w:r>
     </w:p>
     <w:p>
+      <w:pPr>
+        <w:spacing w:before="0" w:after="30" w:line="240" w:lineRule="auto"/>
+      </w:pPr>
       <w:r>
-        <w:t>Technical support, developer operations, QA, evaluation tooling, Python developer tools, public</w:t>
-      </w:r>
-    </w:p>
-    <w:p>
-      <w:r>
-        <w:t>operations, grounds, parks, facilities, ports, utilities, fire-support, and field-safety roles.</w:t>
-      </w:r>
-    </w:p>
-    <w:p>
-      <w:r>
-        <w:t>Field routes are measured separately from the technical cohort.</w:t>
+        <w:t>Technical support, developer operations, QA, evaluation tooling, Python developer tools, public operations, grounds, parks, facilities, ports, utilities, fire-support, and field-safety roles. Field routes are measured separately from the technical cohort.</w:t>
       </w:r>
     </w:p>
     <w:p>
       <w:pPr>
         <w:pStyle w:val="Heading2"/>
+        <w:spacing w:before="0" w:after="30" w:line="240" w:lineRule="auto"/>
       </w:pPr>
       <w:r>
         <w:t>Accepted external work</w:t>
       </w:r>
     </w:p>
     <w:p>
+      <w:pPr>
+        <w:pStyle w:val="ListBullet"/>
+        <w:spacing w:before="0" w:after="30" w:line="240" w:lineRule="auto"/>
+      </w:pPr>
       <w:r>
         <w:t>Free Law Project litigant-portal PR 820: runnable database-free fast-test documentation.</w:t>
       </w:r>
     </w:p>
     <w:p>
+      <w:pPr>
+        <w:pStyle w:val="ListBullet"/>
+        <w:spacing w:before="0" w:after="30" w:line="240" w:lineRule="auto"/>
+      </w:pPr>
       <w:r>
         <w:t>Hebbian Robotics hflow PR 157: reserved-column drift test coverage.</w:t>
       </w:r>
     </w:p>
     <w:p>
+      <w:pPr>
+        <w:pStyle w:val="ListBullet"/>
+        <w:spacing w:before="0" w:after="30" w:line="240" w:lineRule="auto"/>
+      </w:pPr>
       <w:r>
         <w:t>Voxwire PR 44: offline websocket recording and replay coverage.</w:t>
       </w:r>
     </w:p>
     <w:p>
+      <w:pPr>
+        <w:pStyle w:val="ListBullet"/>
+        <w:spacing w:before="0" w:after="30" w:line="240" w:lineRule="auto"/>
+      </w:pPr>
       <w:r>
         <w:t>DeepEval PR 2822: unhashable tool-output correctness fix.</w:t>
       </w:r>
     </w:p>
     <w:p>
+      <w:pPr>
+        <w:pStyle w:val="ListBullet"/>
+        <w:spacing w:before="0" w:after="30" w:line="240" w:lineRule="auto"/>
+      </w:pPr>
       <w:r>
         <w:t>TOMLKit PR 549: dotted-key sibling preservation fix.</w:t>
       </w:r>
     </w:p>
     <w:p>
+      <w:pPr>
+        <w:pStyle w:val="ListBullet"/>
+        <w:spacing w:before="0" w:after="30" w:line="240" w:lineRule="auto"/>
+      </w:pPr>
       <w:r>
         <w:t>Datasette PR 2815: wrong-arity composite-primary-key URL error handling.</w:t>
       </w:r>
@@ -96,127 +110,113 @@
     <w:p>
       <w:pPr>
         <w:pStyle w:val="Heading2"/>
+        <w:spacing w:before="0" w:after="30" w:line="240" w:lineRule="auto"/>
       </w:pPr>
       <w:r>
         <w:t>Experience</w:t>
       </w:r>
     </w:p>
     <w:p>
+      <w:pPr>
+        <w:spacing w:before="0" w:after="30" w:line="240" w:lineRule="auto"/>
+      </w:pPr>
       <w:r>
-        <w:t>Technical Networking Support, Xbox Division | Redmond, Washington | 2013 to 2014 |</w:t>
+        <w:t>Technical Networking Support, Xbox/Microsoft contract | subcontracted through Stream/Convergys | Wilsonville, Oregon | 2013 to 2014</w:t>
       </w:r>
     </w:p>
     <w:p>
+      <w:pPr>
+        <w:spacing w:before="0" w:after="30" w:line="240" w:lineRule="auto"/>
+      </w:pPr>
       <w:r>
-        <w:t>employer-of-record unknown.</w:t>
+        <w:t>Operations and Commercial Arboriculture Lead | Seattle-area family business | started 2015</w:t>
       </w:r>
     </w:p>
     <w:p>
+      <w:pPr>
+        <w:spacing w:before="0" w:after="30" w:line="240" w:lineRule="auto"/>
+      </w:pPr>
       <w:r>
-        <w:t>Operations and Commercial Arboriculture Lead | Seattle-area family business | started 2015;</w:t>
+        <w:t>Freelance Technical Writer, Documentation, and Product Operations | independent practice | started 2017</w:t>
       </w:r>
     </w:p>
     <w:p>
+      <w:pPr>
+        <w:spacing w:before="0" w:after="30" w:line="240" w:lineRule="auto"/>
+      </w:pPr>
       <w:r>
-        <w:t>current status unconfirmed.</w:t>
+        <w:t>Independent Systems Engineer | independent practice | started 2023</w:t>
       </w:r>
     </w:p>
     <w:p>
+      <w:pPr>
+        <w:spacing w:before="0" w:after="30" w:line="240" w:lineRule="auto"/>
+      </w:pPr>
       <w:r>
-        <w:t>Freelance Technical Writer, Documentation, and Product Operations | independent practice |</w:t>
+        <w:t>These start years do not state current status or an end date; both remain unspecified.</w:t>
       </w:r>
     </w:p>
     <w:p>
-      <w:r>
-        <w:t>started 2017; current status unconfirmed.</w:t>
-      </w:r>
-    </w:p>
-    <w:p>
-      <w:r>
-        <w:t>Independent Systems Engineer | independent practice | started 2023; current status unconfirmed.</w:t>
-      </w:r>
-    </w:p>
-    <w:p>
+      <w:pPr>
+        <w:pStyle w:val="Heading2"/>
+        <w:spacing w:before="0" w:after="30" w:line="240" w:lineRule="auto"/>
+      </w:pPr>
       <w:r>
         <w:t>Owned systems and public research</w:t>
       </w:r>
     </w:p>
     <w:p>
+      <w:pPr>
+        <w:spacing w:before="0" w:after="30" w:line="240" w:lineRule="auto"/>
+      </w:pPr>
       <w:r>
-        <w:t>Flywheel is a shipped agent-workflow platform. Separate public work includes Terminal State</w:t>
+        <w:t>Flywheel is a shipped agent-workflow platform. Separate public work includes Terminal State Fixtures, BuildLang, Gather, Index, Crucible, BRender Archival, Engine Revival, retro-system pages, and public-safe security and evaluation documentation.</w:t>
       </w:r>
     </w:p>
     <w:p>
+      <w:pPr>
+        <w:spacing w:before="0" w:after="30" w:line="240" w:lineRule="auto"/>
+      </w:pPr>
       <w:r>
-        <w:t>Fixtures, BuildLang, Gather, Index, Crucible, BRender Archival, Engine Revival, retro-system</w:t>
+        <w:t>Eight public research records are indexed on Publications, including DOI records such as doi.org/10.5281/zenodo.21230267. They are not peer reviewed unless a page later records an explicit peer-review status.</w:t>
       </w:r>
     </w:p>
     <w:p>
+      <w:pPr>
+        <w:spacing w:before="0" w:after="30" w:line="240" w:lineRule="auto"/>
+      </w:pPr>
       <w:r>
-        <w:t>pages, and public-safe security and evaluation documentation.</w:t>
-      </w:r>
-    </w:p>
-    <w:p>
-      <w:r>
-        <w:t>Eight public research records are indexed on</w:t>
-      </w:r>
-    </w:p>
-    <w:p>
-      <w:r>
-        <w:t>Publications</w:t>
-      </w:r>
-    </w:p>
-    <w:p>
-      <w:r>
-        <w:t>, including DOI records such as</w:t>
-      </w:r>
-    </w:p>
-    <w:p>
-      <w:r>
-        <w:t>doi.org/10.5281/zenodo.21230267</w:t>
-      </w:r>
-    </w:p>
-    <w:p>
-      <w:r>
-        <w:t>. They are not peer reviewed unless a page later records an explicit peer-review status.</w:t>
-      </w:r>
-    </w:p>
-    <w:p>
-      <w:r>
-        <w:t>Accepted external work is separated from open work, closed without merge work, and owned project</w:t>
-      </w:r>
-    </w:p>
-    <w:p>
-      <w:r>
-        <w:t>evidence. Open is not accepted, and this CV does not upgrade either status.</w:t>
+        <w:t>Accepted external work is separated from open work, closed without merge work, and owned project evidence. Open is not accepted, and this CV does not upgrade either status.</w:t>
       </w:r>
     </w:p>
     <w:p>
       <w:pPr>
         <w:pStyle w:val="Heading2"/>
+        <w:spacing w:before="0" w:after="30" w:line="240" w:lineRule="auto"/>
       </w:pPr>
       <w:r>
         <w:t>Education</w:t>
       </w:r>
     </w:p>
     <w:p>
+      <w:pPr>
+        <w:spacing w:before="0" w:after="30" w:line="240" w:lineRule="auto"/>
+      </w:pPr>
       <w:r>
         <w:t>High School Diploma, Wilsonville High School, 2013.</w:t>
       </w:r>
     </w:p>
     <w:p>
+      <w:pPr>
+        <w:spacing w:before="0" w:after="30" w:line="240" w:lineRule="auto"/>
+      </w:pPr>
       <w:r>
-        <w:t>Updated 2026-08-28. Public dates preserve unknown months. Phone and legal-name attestation are</w:t>
-      </w:r>
-    </w:p>
-    <w:p>
-      <w:r>
-        <w:t>omitted.</w:t>
+        <w:t>Updated 2026-08-28. Public dates preserve unknown months. Phone and legal-name attestation are omitted.</w:t>
       </w:r>
     </w:p>
     <w:sectPr>
       <w:pgSz w:w="12240" w:h="15840"/>
-      <w:pgMar w:top="792" w:right="936" w:bottom="792" w:left="936" w:header="720" w:footer="720" w:gutter="0"/>
+      <w:pgMar w:top="605" w:right="720" w:bottom="605" w:left="720" w:header="720" w:footer="720" w:gutter="0"/>
       <w:cols w:space="720"/>
       <w:docGrid w:linePitch="360"/>
     </w:sectPr>
@@ -588,7 +588,8 @@
     <w:qFormat/>
     <w:rsid w:val="00FC693F"/>
     <w:rPr>
-      <w:sz w:val="21"/>
+      <w:rFonts w:ascii="Arial" w:hAnsi="Arial"/>
+      <w:sz w:val="16"/>
     </w:rPr>
   </w:style>
   <w:style w:type="paragraph" w:styleId="Header">
@@ -674,11 +675,11 @@
       <w:outlineLvl w:val="1"/>
     </w:pPr>
     <w:rPr>
-      <w:rFonts w:asciiTheme="majorHAnsi" w:eastAsiaTheme="majorEastAsia" w:hAnsiTheme="majorHAnsi" w:cstheme="majorBidi"/>
+      <w:rFonts w:asciiTheme="majorHAnsi" w:eastAsiaTheme="majorEastAsia" w:hAnsiTheme="majorHAnsi" w:cstheme="majorBidi" w:ascii="Arial" w:hAnsi="Arial"/>
       <w:b/>
       <w:bCs/>
       <w:color w:val="4F81BD" w:themeColor="accent1"/>
-      <w:sz w:val="26"/>
+      <w:sz w:val="18"/>
       <w:szCs w:val="26"/>
     </w:rPr>
   </w:style>
@@ -939,11 +940,11 @@
       <w:contextualSpacing/>
     </w:pPr>
     <w:rPr>
-      <w:rFonts w:asciiTheme="majorHAnsi" w:eastAsiaTheme="majorEastAsia" w:hAnsiTheme="majorHAnsi" w:cstheme="majorBidi"/>
+      <w:rFonts w:asciiTheme="majorHAnsi" w:eastAsiaTheme="majorEastAsia" w:hAnsiTheme="majorHAnsi" w:cstheme="majorBidi" w:ascii="Arial" w:hAnsi="Arial"/>
       <w:color w:val="17365D" w:themeColor="text2" w:themeShade="BF"/>
       <w:spacing w:val="5"/>
       <w:kern w:val="28"/>
-      <w:sz w:val="52"/>
+      <w:sz w:val="28"/>
       <w:szCs w:val="52"/>
     </w:rPr>
   </w:style>

</xml_diff>

<commit_message>
Correct public career title and tenure boundary
</commit_message>
<xml_diff>
--- a/career/Zain-Dana-Harper-CV.docx
+++ b/career/Zain-Dana-Harper-CV.docx
@@ -129,7 +129,15 @@
         <w:spacing w:before="0" w:after="30" w:line="240" w:lineRule="auto"/>
       </w:pPr>
       <w:r>
-        <w:t>Operations and Commercial Arboriculture Lead | Seattle-area family business | started 2015</w:t>
+        <w:t>Full-time operations and commercial arboriculture | Legendary Tree (organization label) | April 25, 2015 to June 2, 2026</w:t>
+      </w:r>
+    </w:p>
+    <w:p>
+      <w:pPr>
+        <w:spacing w:before="0" w:after="30" w:line="240" w:lineRule="auto"/>
+      </w:pPr>
+      <w:r>
+        <w:t>Legendary Tree is the applicant-provided organization label; no conventional job title or legal employer of record is asserted.</w:t>
       </w:r>
     </w:p>
     <w:p>
@@ -153,7 +161,7 @@
         <w:spacing w:before="0" w:after="30" w:line="240" w:lineRule="auto"/>
       </w:pPr>
       <w:r>
-        <w:t>These start years do not state current status or an end date; both remain unspecified.</w:t>
+        <w:t>The 2017 and 2023 start years do not state current status or an end date; both remain unspecified.</w:t>
       </w:r>
     </w:p>
     <w:p>

</xml_diff>

<commit_message>
Correct public career title and tenure boundary (#178)
Co-authored-by: Zain Dana Harper <17142659+HarperZ9@users.noreply.github.com>
</commit_message>
<xml_diff>
--- a/career/Zain-Dana-Harper-CV.docx
+++ b/career/Zain-Dana-Harper-CV.docx
@@ -129,7 +129,15 @@
         <w:spacing w:before="0" w:after="30" w:line="240" w:lineRule="auto"/>
       </w:pPr>
       <w:r>
-        <w:t>Operations and Commercial Arboriculture Lead | Seattle-area family business | started 2015</w:t>
+        <w:t>Full-time operations and commercial arboriculture | Legendary Tree (organization label) | April 25, 2015 to June 2, 2026</w:t>
+      </w:r>
+    </w:p>
+    <w:p>
+      <w:pPr>
+        <w:spacing w:before="0" w:after="30" w:line="240" w:lineRule="auto"/>
+      </w:pPr>
+      <w:r>
+        <w:t>Legendary Tree is the applicant-provided organization label; no conventional job title or legal employer of record is asserted.</w:t>
       </w:r>
     </w:p>
     <w:p>
@@ -153,7 +161,7 @@
         <w:spacing w:before="0" w:after="30" w:line="240" w:lineRule="auto"/>
       </w:pPr>
       <w:r>
-        <w:t>These start years do not state current status or an end date; both remain unspecified.</w:t>
+        <w:t>The 2017 and 2023 start years do not state current status or an end date; both remain unspecified.</w:t>
       </w:r>
     </w:p>
     <w:p>

</xml_diff>